<commit_message>
obsidian: sync remaining notes and documents
</commit_message>
<xml_diff>
--- a/20-Work/20.1-Du an/20.54. BV Tu Du/2. Xy ly su co/2026-05-14 - BV Tu Du - Bao cao su co Rabbit tren App 2.docx
+++ b/20-Work/20.1-Du an/20.54. BV Tu Du/2. Xy ly su co/2026-05-14 - BV Tu Du - Bao cao su co Rabbit tren App 2.docx
@@ -26,6 +26,7 @@
       <w:pPr>
         <w:pStyle w:val="Heading1"/>
         <w:spacing w:before="360" w:after="160" w:line="259" w:lineRule="auto"/>
+        <w:jc w:val="left"/>
         <w:pBdr>
           <w:bottom w:val="single" w:sz="8" w:space="4" w:color="A9E5DD"/>
         </w:pBdr>
@@ -43,8 +44,12 @@
     </w:p>
     <w:p>
       <w:pPr>
+        <w:tabs>
+          <w:tab w:pos="510" w:val="left"/>
+        </w:tabs>
         <w:spacing w:before="0" w:after="100" w:line="300" w:lineRule="auto"/>
-        <w:ind w:left="482" w:hanging="159"/>
+        <w:ind w:left="510" w:hanging="238"/>
+        <w:jc w:val="both"/>
       </w:pPr>
       <w:r>
         <w:rPr>
@@ -54,7 +59,8 @@
           <w:color w:val="08605A"/>
           <w:sz w:val="23"/>
         </w:rPr>
-        <w:t xml:space="preserve">•  </w:t>
+        <w:t>•</w:t>
+        <w:tab/>
       </w:r>
       <w:r>
         <w:rPr>
@@ -69,8 +75,12 @@
     </w:p>
     <w:p>
       <w:pPr>
+        <w:tabs>
+          <w:tab w:pos="510" w:val="left"/>
+        </w:tabs>
         <w:spacing w:before="0" w:after="100" w:line="300" w:lineRule="auto"/>
-        <w:ind w:left="482" w:hanging="159"/>
+        <w:ind w:left="510" w:hanging="238"/>
+        <w:jc w:val="both"/>
       </w:pPr>
       <w:r>
         <w:rPr>
@@ -80,7 +90,8 @@
           <w:color w:val="08605A"/>
           <w:sz w:val="23"/>
         </w:rPr>
-        <w:t xml:space="preserve">•  </w:t>
+        <w:t>•</w:t>
+        <w:tab/>
       </w:r>
       <w:r>
         <w:rPr>
@@ -127,8 +138,12 @@
     </w:p>
     <w:p>
       <w:pPr>
+        <w:tabs>
+          <w:tab w:pos="510" w:val="left"/>
+        </w:tabs>
         <w:spacing w:before="0" w:after="100" w:line="300" w:lineRule="auto"/>
-        <w:ind w:left="482" w:hanging="159"/>
+        <w:ind w:left="510" w:hanging="238"/>
+        <w:jc w:val="both"/>
       </w:pPr>
       <w:r>
         <w:rPr>
@@ -138,7 +153,8 @@
           <w:color w:val="08605A"/>
           <w:sz w:val="23"/>
         </w:rPr>
-        <w:t xml:space="preserve">•  </w:t>
+        <w:t>•</w:t>
+        <w:tab/>
       </w:r>
       <w:r>
         <w:rPr>
@@ -153,8 +169,12 @@
     </w:p>
     <w:p>
       <w:pPr>
+        <w:tabs>
+          <w:tab w:pos="510" w:val="left"/>
+        </w:tabs>
         <w:spacing w:before="0" w:after="100" w:line="300" w:lineRule="auto"/>
-        <w:ind w:left="482" w:hanging="159"/>
+        <w:ind w:left="510" w:hanging="238"/>
+        <w:jc w:val="both"/>
       </w:pPr>
       <w:r>
         <w:rPr>
@@ -164,7 +184,8 @@
           <w:color w:val="08605A"/>
           <w:sz w:val="23"/>
         </w:rPr>
-        <w:t xml:space="preserve">•  </w:t>
+        <w:t>•</w:t>
+        <w:tab/>
       </w:r>
       <w:r>
         <w:rPr>
@@ -179,8 +200,12 @@
     </w:p>
     <w:p>
       <w:pPr>
+        <w:tabs>
+          <w:tab w:pos="510" w:val="left"/>
+        </w:tabs>
         <w:spacing w:before="0" w:after="100" w:line="300" w:lineRule="auto"/>
-        <w:ind w:left="482" w:hanging="159"/>
+        <w:ind w:left="510" w:hanging="238"/>
+        <w:jc w:val="both"/>
       </w:pPr>
       <w:r>
         <w:rPr>
@@ -190,7 +215,8 @@
           <w:color w:val="08605A"/>
           <w:sz w:val="23"/>
         </w:rPr>
-        <w:t xml:space="preserve">•  </w:t>
+        <w:t>•</w:t>
+        <w:tab/>
       </w:r>
       <w:r>
         <w:rPr>
@@ -205,8 +231,12 @@
     </w:p>
     <w:p>
       <w:pPr>
+        <w:tabs>
+          <w:tab w:pos="510" w:val="left"/>
+        </w:tabs>
         <w:spacing w:before="0" w:after="100" w:line="300" w:lineRule="auto"/>
-        <w:ind w:left="482" w:hanging="159"/>
+        <w:ind w:left="510" w:hanging="238"/>
+        <w:jc w:val="both"/>
       </w:pPr>
       <w:r>
         <w:rPr>
@@ -216,7 +246,8 @@
           <w:color w:val="08605A"/>
           <w:sz w:val="23"/>
         </w:rPr>
-        <w:t xml:space="preserve">•  </w:t>
+        <w:t>•</w:t>
+        <w:tab/>
       </w:r>
       <w:r>
         <w:rPr>
@@ -233,6 +264,7 @@
       <w:pPr>
         <w:pStyle w:val="Heading1"/>
         <w:spacing w:before="360" w:after="160" w:line="259" w:lineRule="auto"/>
+        <w:jc w:val="left"/>
         <w:pBdr>
           <w:bottom w:val="single" w:sz="8" w:space="4" w:color="A9E5DD"/>
         </w:pBdr>
@@ -250,8 +282,12 @@
     </w:p>
     <w:p>
       <w:pPr>
+        <w:tabs>
+          <w:tab w:pos="510" w:val="left"/>
+        </w:tabs>
         <w:spacing w:before="0" w:after="100" w:line="300" w:lineRule="auto"/>
-        <w:ind w:left="482" w:hanging="159"/>
+        <w:ind w:left="510" w:hanging="238"/>
+        <w:jc w:val="both"/>
       </w:pPr>
       <w:r>
         <w:rPr>
@@ -261,7 +297,8 @@
           <w:color w:val="08605A"/>
           <w:sz w:val="23"/>
         </w:rPr>
-        <w:t xml:space="preserve">•  </w:t>
+        <w:t>•</w:t>
+        <w:tab/>
       </w:r>
       <w:r>
         <w:rPr>
@@ -318,8 +355,12 @@
     </w:p>
     <w:p>
       <w:pPr>
+        <w:tabs>
+          <w:tab w:pos="510" w:val="left"/>
+        </w:tabs>
         <w:spacing w:before="0" w:after="100" w:line="300" w:lineRule="auto"/>
-        <w:ind w:left="482" w:hanging="159"/>
+        <w:ind w:left="510" w:hanging="238"/>
+        <w:jc w:val="both"/>
       </w:pPr>
       <w:r>
         <w:rPr>
@@ -329,7 +370,8 @@
           <w:color w:val="08605A"/>
           <w:sz w:val="23"/>
         </w:rPr>
-        <w:t xml:space="preserve">•  </w:t>
+        <w:t>•</w:t>
+        <w:tab/>
       </w:r>
       <w:r>
         <w:rPr>
@@ -365,8 +407,12 @@
     </w:p>
     <w:p>
       <w:pPr>
+        <w:tabs>
+          <w:tab w:pos="510" w:val="left"/>
+        </w:tabs>
         <w:spacing w:before="0" w:after="100" w:line="300" w:lineRule="auto"/>
-        <w:ind w:left="482" w:hanging="159"/>
+        <w:ind w:left="510" w:hanging="238"/>
+        <w:jc w:val="both"/>
       </w:pPr>
       <w:r>
         <w:rPr>
@@ -376,7 +422,8 @@
           <w:color w:val="08605A"/>
           <w:sz w:val="23"/>
         </w:rPr>
-        <w:t xml:space="preserve">•  </w:t>
+        <w:t>•</w:t>
+        <w:tab/>
       </w:r>
       <w:r>
         <w:rPr>
@@ -412,8 +459,12 @@
     </w:p>
     <w:p>
       <w:pPr>
+        <w:tabs>
+          <w:tab w:pos="510" w:val="left"/>
+        </w:tabs>
         <w:spacing w:before="0" w:after="100" w:line="300" w:lineRule="auto"/>
-        <w:ind w:left="482" w:hanging="159"/>
+        <w:ind w:left="510" w:hanging="238"/>
+        <w:jc w:val="both"/>
       </w:pPr>
       <w:r>
         <w:rPr>
@@ -423,7 +474,8 @@
           <w:color w:val="08605A"/>
           <w:sz w:val="23"/>
         </w:rPr>
-        <w:t xml:space="preserve">•  </w:t>
+        <w:t>•</w:t>
+        <w:tab/>
       </w:r>
       <w:r>
         <w:rPr>
@@ -480,8 +532,12 @@
     </w:p>
     <w:p>
       <w:pPr>
+        <w:tabs>
+          <w:tab w:pos="510" w:val="left"/>
+        </w:tabs>
         <w:spacing w:before="0" w:after="100" w:line="300" w:lineRule="auto"/>
-        <w:ind w:left="482" w:hanging="159"/>
+        <w:ind w:left="510" w:hanging="238"/>
+        <w:jc w:val="both"/>
       </w:pPr>
       <w:r>
         <w:rPr>
@@ -491,7 +547,8 @@
           <w:color w:val="08605A"/>
           <w:sz w:val="23"/>
         </w:rPr>
-        <w:t xml:space="preserve">•  </w:t>
+        <w:t>•</w:t>
+        <w:tab/>
       </w:r>
       <w:r>
         <w:rPr>
@@ -569,8 +626,12 @@
     </w:p>
     <w:p>
       <w:pPr>
+        <w:tabs>
+          <w:tab w:pos="510" w:val="left"/>
+        </w:tabs>
         <w:spacing w:before="0" w:after="100" w:line="300" w:lineRule="auto"/>
-        <w:ind w:left="482" w:hanging="159"/>
+        <w:ind w:left="510" w:hanging="238"/>
+        <w:jc w:val="both"/>
       </w:pPr>
       <w:r>
         <w:rPr>
@@ -580,7 +641,8 @@
           <w:color w:val="08605A"/>
           <w:sz w:val="23"/>
         </w:rPr>
-        <w:t xml:space="preserve">•  </w:t>
+        <w:t>•</w:t>
+        <w:tab/>
       </w:r>
       <w:r>
         <w:rPr>
@@ -597,6 +659,7 @@
       <w:pPr>
         <w:pStyle w:val="Heading1"/>
         <w:spacing w:before="360" w:after="160" w:line="259" w:lineRule="auto"/>
+        <w:jc w:val="left"/>
         <w:pBdr>
           <w:bottom w:val="single" w:sz="8" w:space="4" w:color="A9E5DD"/>
         </w:pBdr>
@@ -614,8 +677,12 @@
     </w:p>
     <w:p>
       <w:pPr>
+        <w:tabs>
+          <w:tab w:pos="510" w:val="left"/>
+        </w:tabs>
         <w:spacing w:before="0" w:after="100" w:line="300" w:lineRule="auto"/>
-        <w:ind w:left="482" w:hanging="159"/>
+        <w:ind w:left="510" w:hanging="238"/>
+        <w:jc w:val="both"/>
       </w:pPr>
       <w:r>
         <w:rPr>
@@ -625,7 +692,8 @@
           <w:color w:val="08605A"/>
           <w:sz w:val="23"/>
         </w:rPr>
-        <w:t xml:space="preserve">•  </w:t>
+        <w:t>•</w:t>
+        <w:tab/>
       </w:r>
       <w:r>
         <w:rPr>
@@ -640,8 +708,12 @@
     </w:p>
     <w:p>
       <w:pPr>
+        <w:tabs>
+          <w:tab w:pos="918" w:val="left"/>
+        </w:tabs>
         <w:spacing w:before="0" w:after="100" w:line="300" w:lineRule="auto"/>
-        <w:ind w:left="879" w:hanging="159"/>
+        <w:ind w:left="918" w:hanging="238"/>
+        <w:jc w:val="both"/>
       </w:pPr>
       <w:r>
         <w:rPr>
@@ -651,7 +723,8 @@
           <w:color w:val="08605A"/>
           <w:sz w:val="23"/>
         </w:rPr>
-        <w:t xml:space="preserve">◦  </w:t>
+        <w:t>◦</w:t>
+        <w:tab/>
       </w:r>
       <w:r>
         <w:rPr>
@@ -687,8 +760,12 @@
     </w:p>
     <w:p>
       <w:pPr>
+        <w:tabs>
+          <w:tab w:pos="918" w:val="left"/>
+        </w:tabs>
         <w:spacing w:before="0" w:after="100" w:line="300" w:lineRule="auto"/>
-        <w:ind w:left="879" w:hanging="159"/>
+        <w:ind w:left="918" w:hanging="238"/>
+        <w:jc w:val="both"/>
       </w:pPr>
       <w:r>
         <w:rPr>
@@ -698,7 +775,8 @@
           <w:color w:val="08605A"/>
           <w:sz w:val="23"/>
         </w:rPr>
-        <w:t xml:space="preserve">◦  </w:t>
+        <w:t>◦</w:t>
+        <w:tab/>
       </w:r>
       <w:r>
         <w:rPr>
@@ -713,8 +791,12 @@
     </w:p>
     <w:p>
       <w:pPr>
+        <w:tabs>
+          <w:tab w:pos="918" w:val="left"/>
+        </w:tabs>
         <w:spacing w:before="0" w:after="100" w:line="300" w:lineRule="auto"/>
-        <w:ind w:left="879" w:hanging="159"/>
+        <w:ind w:left="918" w:hanging="238"/>
+        <w:jc w:val="both"/>
       </w:pPr>
       <w:r>
         <w:rPr>
@@ -724,7 +806,8 @@
           <w:color w:val="08605A"/>
           <w:sz w:val="23"/>
         </w:rPr>
-        <w:t xml:space="preserve">◦  </w:t>
+        <w:t>◦</w:t>
+        <w:tab/>
       </w:r>
       <w:r>
         <w:rPr>
@@ -739,8 +822,12 @@
     </w:p>
     <w:p>
       <w:pPr>
+        <w:tabs>
+          <w:tab w:pos="918" w:val="left"/>
+        </w:tabs>
         <w:spacing w:before="0" w:after="100" w:line="300" w:lineRule="auto"/>
-        <w:ind w:left="879" w:hanging="159"/>
+        <w:ind w:left="918" w:hanging="238"/>
+        <w:jc w:val="both"/>
       </w:pPr>
       <w:r>
         <w:rPr>
@@ -750,7 +837,8 @@
           <w:color w:val="08605A"/>
           <w:sz w:val="23"/>
         </w:rPr>
-        <w:t xml:space="preserve">◦  </w:t>
+        <w:t>◦</w:t>
+        <w:tab/>
       </w:r>
       <w:r>
         <w:rPr>
@@ -765,8 +853,12 @@
     </w:p>
     <w:p>
       <w:pPr>
+        <w:tabs>
+          <w:tab w:pos="510" w:val="left"/>
+        </w:tabs>
         <w:spacing w:before="0" w:after="100" w:line="300" w:lineRule="auto"/>
-        <w:ind w:left="482" w:hanging="159"/>
+        <w:ind w:left="510" w:hanging="238"/>
+        <w:jc w:val="both"/>
       </w:pPr>
       <w:r>
         <w:rPr>
@@ -776,7 +868,8 @@
           <w:color w:val="08605A"/>
           <w:sz w:val="23"/>
         </w:rPr>
-        <w:t xml:space="preserve">•  </w:t>
+        <w:t>•</w:t>
+        <w:tab/>
       </w:r>
       <w:r>
         <w:rPr>
@@ -791,8 +884,12 @@
     </w:p>
     <w:p>
       <w:pPr>
+        <w:tabs>
+          <w:tab w:pos="918" w:val="left"/>
+        </w:tabs>
         <w:spacing w:before="0" w:after="100" w:line="300" w:lineRule="auto"/>
-        <w:ind w:left="879" w:hanging="159"/>
+        <w:ind w:left="918" w:hanging="238"/>
+        <w:jc w:val="both"/>
       </w:pPr>
       <w:r>
         <w:rPr>
@@ -802,7 +899,8 @@
           <w:color w:val="08605A"/>
           <w:sz w:val="23"/>
         </w:rPr>
-        <w:t xml:space="preserve">◦  </w:t>
+        <w:t>◦</w:t>
+        <w:tab/>
       </w:r>
       <w:r>
         <w:rPr>
@@ -859,8 +957,12 @@
     </w:p>
     <w:p>
       <w:pPr>
+        <w:tabs>
+          <w:tab w:pos="918" w:val="left"/>
+        </w:tabs>
         <w:spacing w:before="0" w:after="100" w:line="300" w:lineRule="auto"/>
-        <w:ind w:left="879" w:hanging="159"/>
+        <w:ind w:left="918" w:hanging="238"/>
+        <w:jc w:val="both"/>
       </w:pPr>
       <w:r>
         <w:rPr>
@@ -870,7 +972,8 @@
           <w:color w:val="08605A"/>
           <w:sz w:val="23"/>
         </w:rPr>
-        <w:t xml:space="preserve">◦  </w:t>
+        <w:t>◦</w:t>
+        <w:tab/>
       </w:r>
       <w:r>
         <w:rPr>
@@ -927,8 +1030,12 @@
     </w:p>
     <w:p>
       <w:pPr>
+        <w:tabs>
+          <w:tab w:pos="918" w:val="left"/>
+        </w:tabs>
         <w:spacing w:before="0" w:after="100" w:line="300" w:lineRule="auto"/>
-        <w:ind w:left="879" w:hanging="159"/>
+        <w:ind w:left="918" w:hanging="238"/>
+        <w:jc w:val="both"/>
       </w:pPr>
       <w:r>
         <w:rPr>
@@ -938,7 +1045,8 @@
           <w:color w:val="08605A"/>
           <w:sz w:val="23"/>
         </w:rPr>
-        <w:t xml:space="preserve">◦  </w:t>
+        <w:t>◦</w:t>
+        <w:tab/>
       </w:r>
       <w:r>
         <w:rPr>
@@ -953,8 +1061,12 @@
     </w:p>
     <w:p>
       <w:pPr>
+        <w:tabs>
+          <w:tab w:pos="918" w:val="left"/>
+        </w:tabs>
         <w:spacing w:before="0" w:after="100" w:line="300" w:lineRule="auto"/>
-        <w:ind w:left="879" w:hanging="159"/>
+        <w:ind w:left="918" w:hanging="238"/>
+        <w:jc w:val="both"/>
       </w:pPr>
       <w:r>
         <w:rPr>
@@ -964,7 +1076,8 @@
           <w:color w:val="08605A"/>
           <w:sz w:val="23"/>
         </w:rPr>
-        <w:t xml:space="preserve">◦  </w:t>
+        <w:t>◦</w:t>
+        <w:tab/>
       </w:r>
       <w:r>
         <w:rPr>
@@ -981,6 +1094,7 @@
       <w:pPr>
         <w:pStyle w:val="Heading1"/>
         <w:spacing w:before="360" w:after="160" w:line="259" w:lineRule="auto"/>
+        <w:jc w:val="left"/>
         <w:pBdr>
           <w:bottom w:val="single" w:sz="8" w:space="4" w:color="A9E5DD"/>
         </w:pBdr>
@@ -998,8 +1112,12 @@
     </w:p>
     <w:p>
       <w:pPr>
+        <w:tabs>
+          <w:tab w:pos="510" w:val="left"/>
+        </w:tabs>
         <w:spacing w:before="0" w:after="100" w:line="300" w:lineRule="auto"/>
-        <w:ind w:left="482" w:hanging="159"/>
+        <w:ind w:left="510" w:hanging="238"/>
+        <w:jc w:val="both"/>
       </w:pPr>
       <w:r>
         <w:rPr>
@@ -1009,7 +1127,8 @@
           <w:color w:val="08605A"/>
           <w:sz w:val="23"/>
         </w:rPr>
-        <w:t xml:space="preserve">•  </w:t>
+        <w:t>•</w:t>
+        <w:tab/>
       </w:r>
       <w:r>
         <w:rPr>
@@ -1024,8 +1143,12 @@
     </w:p>
     <w:p>
       <w:pPr>
+        <w:tabs>
+          <w:tab w:pos="918" w:val="left"/>
+        </w:tabs>
         <w:spacing w:before="0" w:after="100" w:line="300" w:lineRule="auto"/>
-        <w:ind w:left="879" w:hanging="159"/>
+        <w:ind w:left="918" w:hanging="238"/>
+        <w:jc w:val="both"/>
       </w:pPr>
       <w:r>
         <w:rPr>
@@ -1035,7 +1158,8 @@
           <w:color w:val="08605A"/>
           <w:sz w:val="23"/>
         </w:rPr>
-        <w:t xml:space="preserve">◦  </w:t>
+        <w:t>◦</w:t>
+        <w:tab/>
       </w:r>
       <w:r>
         <w:rPr>
@@ -1092,8 +1216,12 @@
     </w:p>
     <w:p>
       <w:pPr>
+        <w:tabs>
+          <w:tab w:pos="918" w:val="left"/>
+        </w:tabs>
         <w:spacing w:before="0" w:after="100" w:line="300" w:lineRule="auto"/>
-        <w:ind w:left="879" w:hanging="159"/>
+        <w:ind w:left="918" w:hanging="238"/>
+        <w:jc w:val="both"/>
       </w:pPr>
       <w:r>
         <w:rPr>
@@ -1103,7 +1231,8 @@
           <w:color w:val="08605A"/>
           <w:sz w:val="23"/>
         </w:rPr>
-        <w:t xml:space="preserve">◦  </w:t>
+        <w:t>◦</w:t>
+        <w:tab/>
       </w:r>
       <w:r>
         <w:rPr>
@@ -1139,8 +1268,12 @@
     </w:p>
     <w:p>
       <w:pPr>
+        <w:tabs>
+          <w:tab w:pos="510" w:val="left"/>
+        </w:tabs>
         <w:spacing w:before="0" w:after="100" w:line="300" w:lineRule="auto"/>
-        <w:ind w:left="482" w:hanging="159"/>
+        <w:ind w:left="510" w:hanging="238"/>
+        <w:jc w:val="both"/>
       </w:pPr>
       <w:r>
         <w:rPr>
@@ -1150,7 +1283,8 @@
           <w:color w:val="08605A"/>
           <w:sz w:val="23"/>
         </w:rPr>
-        <w:t xml:space="preserve">•  </w:t>
+        <w:t>•</w:t>
+        <w:tab/>
       </w:r>
       <w:r>
         <w:rPr>
@@ -1165,8 +1299,12 @@
     </w:p>
     <w:p>
       <w:pPr>
+        <w:tabs>
+          <w:tab w:pos="918" w:val="left"/>
+        </w:tabs>
         <w:spacing w:before="0" w:after="100" w:line="300" w:lineRule="auto"/>
-        <w:ind w:left="879" w:hanging="159"/>
+        <w:ind w:left="918" w:hanging="238"/>
+        <w:jc w:val="both"/>
       </w:pPr>
       <w:r>
         <w:rPr>
@@ -1176,7 +1314,8 @@
           <w:color w:val="08605A"/>
           <w:sz w:val="23"/>
         </w:rPr>
-        <w:t xml:space="preserve">◦  </w:t>
+        <w:t>◦</w:t>
+        <w:tab/>
       </w:r>
       <w:r>
         <w:rPr>
@@ -1191,8 +1330,12 @@
     </w:p>
     <w:p>
       <w:pPr>
+        <w:tabs>
+          <w:tab w:pos="510" w:val="left"/>
+        </w:tabs>
         <w:spacing w:before="0" w:after="100" w:line="300" w:lineRule="auto"/>
-        <w:ind w:left="482" w:hanging="159"/>
+        <w:ind w:left="510" w:hanging="238"/>
+        <w:jc w:val="both"/>
       </w:pPr>
       <w:r>
         <w:rPr>
@@ -1202,7 +1345,8 @@
           <w:color w:val="08605A"/>
           <w:sz w:val="23"/>
         </w:rPr>
-        <w:t xml:space="preserve">•  </w:t>
+        <w:t>•</w:t>
+        <w:tab/>
       </w:r>
       <w:r>
         <w:rPr>
@@ -1217,8 +1361,12 @@
     </w:p>
     <w:p>
       <w:pPr>
+        <w:tabs>
+          <w:tab w:pos="918" w:val="left"/>
+        </w:tabs>
         <w:spacing w:before="0" w:after="100" w:line="300" w:lineRule="auto"/>
-        <w:ind w:left="879" w:hanging="159"/>
+        <w:ind w:left="918" w:hanging="238"/>
+        <w:jc w:val="both"/>
       </w:pPr>
       <w:r>
         <w:rPr>
@@ -1228,7 +1376,8 @@
           <w:color w:val="08605A"/>
           <w:sz w:val="23"/>
         </w:rPr>
-        <w:t xml:space="preserve">◦  </w:t>
+        <w:t>◦</w:t>
+        <w:tab/>
       </w:r>
       <w:r>
         <w:rPr>
@@ -1285,8 +1434,12 @@
     </w:p>
     <w:p>
       <w:pPr>
+        <w:tabs>
+          <w:tab w:pos="918" w:val="left"/>
+        </w:tabs>
         <w:spacing w:before="0" w:after="100" w:line="300" w:lineRule="auto"/>
-        <w:ind w:left="879" w:hanging="159"/>
+        <w:ind w:left="918" w:hanging="238"/>
+        <w:jc w:val="both"/>
       </w:pPr>
       <w:r>
         <w:rPr>
@@ -1296,7 +1449,8 @@
           <w:color w:val="08605A"/>
           <w:sz w:val="23"/>
         </w:rPr>
-        <w:t xml:space="preserve">◦  </w:t>
+        <w:t>◦</w:t>
+        <w:tab/>
       </w:r>
       <w:r>
         <w:rPr>
@@ -1332,8 +1486,12 @@
     </w:p>
     <w:p>
       <w:pPr>
+        <w:tabs>
+          <w:tab w:pos="510" w:val="left"/>
+        </w:tabs>
         <w:spacing w:before="0" w:after="100" w:line="300" w:lineRule="auto"/>
-        <w:ind w:left="482" w:hanging="159"/>
+        <w:ind w:left="510" w:hanging="238"/>
+        <w:jc w:val="both"/>
       </w:pPr>
       <w:r>
         <w:rPr>
@@ -1343,7 +1501,8 @@
           <w:color w:val="08605A"/>
           <w:sz w:val="23"/>
         </w:rPr>
-        <w:t xml:space="preserve">•  </w:t>
+        <w:t>•</w:t>
+        <w:tab/>
       </w:r>
       <w:r>
         <w:rPr>
@@ -1358,8 +1517,12 @@
     </w:p>
     <w:p>
       <w:pPr>
+        <w:tabs>
+          <w:tab w:pos="918" w:val="left"/>
+        </w:tabs>
         <w:spacing w:before="0" w:after="100" w:line="300" w:lineRule="auto"/>
-        <w:ind w:left="879" w:hanging="159"/>
+        <w:ind w:left="918" w:hanging="238"/>
+        <w:jc w:val="both"/>
       </w:pPr>
       <w:r>
         <w:rPr>
@@ -1369,7 +1532,8 @@
           <w:color w:val="08605A"/>
           <w:sz w:val="23"/>
         </w:rPr>
-        <w:t xml:space="preserve">◦  </w:t>
+        <w:t>◦</w:t>
+        <w:tab/>
       </w:r>
       <w:r>
         <w:rPr>
@@ -1384,8 +1548,12 @@
     </w:p>
     <w:p>
       <w:pPr>
+        <w:tabs>
+          <w:tab w:pos="510" w:val="left"/>
+        </w:tabs>
         <w:spacing w:before="0" w:after="100" w:line="300" w:lineRule="auto"/>
-        <w:ind w:left="482" w:hanging="159"/>
+        <w:ind w:left="510" w:hanging="238"/>
+        <w:jc w:val="both"/>
       </w:pPr>
       <w:r>
         <w:rPr>
@@ -1395,7 +1563,8 @@
           <w:color w:val="08605A"/>
           <w:sz w:val="23"/>
         </w:rPr>
-        <w:t xml:space="preserve">•  </w:t>
+        <w:t>•</w:t>
+        <w:tab/>
       </w:r>
       <w:r>
         <w:rPr>
@@ -1410,8 +1579,12 @@
     </w:p>
     <w:p>
       <w:pPr>
+        <w:tabs>
+          <w:tab w:pos="918" w:val="left"/>
+        </w:tabs>
         <w:spacing w:before="0" w:after="100" w:line="300" w:lineRule="auto"/>
-        <w:ind w:left="879" w:hanging="159"/>
+        <w:ind w:left="918" w:hanging="238"/>
+        <w:jc w:val="both"/>
       </w:pPr>
       <w:r>
         <w:rPr>
@@ -1421,7 +1594,8 @@
           <w:color w:val="08605A"/>
           <w:sz w:val="23"/>
         </w:rPr>
-        <w:t xml:space="preserve">◦  </w:t>
+        <w:t>◦</w:t>
+        <w:tab/>
       </w:r>
       <w:r>
         <w:rPr>
@@ -1457,8 +1631,12 @@
     </w:p>
     <w:p>
       <w:pPr>
+        <w:tabs>
+          <w:tab w:pos="918" w:val="left"/>
+        </w:tabs>
         <w:spacing w:before="0" w:after="100" w:line="300" w:lineRule="auto"/>
-        <w:ind w:left="879" w:hanging="159"/>
+        <w:ind w:left="918" w:hanging="238"/>
+        <w:jc w:val="both"/>
       </w:pPr>
       <w:r>
         <w:rPr>
@@ -1468,7 +1646,8 @@
           <w:color w:val="08605A"/>
           <w:sz w:val="23"/>
         </w:rPr>
-        <w:t xml:space="preserve">◦  </w:t>
+        <w:t>◦</w:t>
+        <w:tab/>
       </w:r>
       <w:r>
         <w:rPr>
@@ -1483,8 +1662,12 @@
     </w:p>
     <w:p>
       <w:pPr>
+        <w:tabs>
+          <w:tab w:pos="918" w:val="left"/>
+        </w:tabs>
         <w:spacing w:before="0" w:after="100" w:line="300" w:lineRule="auto"/>
-        <w:ind w:left="879" w:hanging="159"/>
+        <w:ind w:left="918" w:hanging="238"/>
+        <w:jc w:val="both"/>
       </w:pPr>
       <w:r>
         <w:rPr>
@@ -1494,7 +1677,8 @@
           <w:color w:val="08605A"/>
           <w:sz w:val="23"/>
         </w:rPr>
-        <w:t xml:space="preserve">◦  </w:t>
+        <w:t>◦</w:t>
+        <w:tab/>
       </w:r>
       <w:r>
         <w:rPr>
@@ -1509,8 +1693,12 @@
     </w:p>
     <w:p>
       <w:pPr>
+        <w:tabs>
+          <w:tab w:pos="510" w:val="left"/>
+        </w:tabs>
         <w:spacing w:before="0" w:after="100" w:line="300" w:lineRule="auto"/>
-        <w:ind w:left="482" w:hanging="159"/>
+        <w:ind w:left="510" w:hanging="238"/>
+        <w:jc w:val="both"/>
       </w:pPr>
       <w:r>
         <w:rPr>
@@ -1520,7 +1708,8 @@
           <w:color w:val="08605A"/>
           <w:sz w:val="23"/>
         </w:rPr>
-        <w:t xml:space="preserve">•  </w:t>
+        <w:t>•</w:t>
+        <w:tab/>
       </w:r>
       <w:r>
         <w:rPr>
@@ -1627,8 +1816,12 @@
     </w:p>
     <w:p>
       <w:pPr>
+        <w:tabs>
+          <w:tab w:pos="510" w:val="left"/>
+        </w:tabs>
         <w:spacing w:before="0" w:after="100" w:line="300" w:lineRule="auto"/>
-        <w:ind w:left="482" w:hanging="159"/>
+        <w:ind w:left="510" w:hanging="238"/>
+        <w:jc w:val="both"/>
       </w:pPr>
       <w:r>
         <w:rPr>
@@ -1638,7 +1831,8 @@
           <w:color w:val="08605A"/>
           <w:sz w:val="23"/>
         </w:rPr>
-        <w:t xml:space="preserve">•  </w:t>
+        <w:t>•</w:t>
+        <w:tab/>
       </w:r>
       <w:r>
         <w:rPr>
@@ -1653,8 +1847,12 @@
     </w:p>
     <w:p>
       <w:pPr>
+        <w:tabs>
+          <w:tab w:pos="918" w:val="left"/>
+        </w:tabs>
         <w:spacing w:before="0" w:after="100" w:line="300" w:lineRule="auto"/>
-        <w:ind w:left="879" w:hanging="159"/>
+        <w:ind w:left="918" w:hanging="238"/>
+        <w:jc w:val="both"/>
       </w:pPr>
       <w:r>
         <w:rPr>
@@ -1664,7 +1862,8 @@
           <w:color w:val="08605A"/>
           <w:sz w:val="23"/>
         </w:rPr>
-        <w:t xml:space="preserve">◦  </w:t>
+        <w:t>◦</w:t>
+        <w:tab/>
       </w:r>
       <w:r>
         <w:rPr>
@@ -1679,8 +1878,12 @@
     </w:p>
     <w:p>
       <w:pPr>
+        <w:tabs>
+          <w:tab w:pos="918" w:val="left"/>
+        </w:tabs>
         <w:spacing w:before="0" w:after="100" w:line="300" w:lineRule="auto"/>
-        <w:ind w:left="879" w:hanging="159"/>
+        <w:ind w:left="918" w:hanging="238"/>
+        <w:jc w:val="both"/>
       </w:pPr>
       <w:r>
         <w:rPr>
@@ -1690,7 +1893,8 @@
           <w:color w:val="08605A"/>
           <w:sz w:val="23"/>
         </w:rPr>
-        <w:t xml:space="preserve">◦  </w:t>
+        <w:t>◦</w:t>
+        <w:tab/>
       </w:r>
       <w:r>
         <w:rPr>
@@ -1747,8 +1951,12 @@
     </w:p>
     <w:p>
       <w:pPr>
+        <w:tabs>
+          <w:tab w:pos="510" w:val="left"/>
+        </w:tabs>
         <w:spacing w:before="0" w:after="100" w:line="300" w:lineRule="auto"/>
-        <w:ind w:left="482" w:hanging="159"/>
+        <w:ind w:left="510" w:hanging="238"/>
+        <w:jc w:val="both"/>
       </w:pPr>
       <w:r>
         <w:rPr>
@@ -1758,7 +1966,8 @@
           <w:color w:val="08605A"/>
           <w:sz w:val="23"/>
         </w:rPr>
-        <w:t xml:space="preserve">•  </w:t>
+        <w:t>•</w:t>
+        <w:tab/>
       </w:r>
       <w:r>
         <w:rPr>
@@ -1773,8 +1982,12 @@
     </w:p>
     <w:p>
       <w:pPr>
+        <w:tabs>
+          <w:tab w:pos="918" w:val="left"/>
+        </w:tabs>
         <w:spacing w:before="0" w:after="100" w:line="300" w:lineRule="auto"/>
-        <w:ind w:left="879" w:hanging="159"/>
+        <w:ind w:left="918" w:hanging="238"/>
+        <w:jc w:val="both"/>
       </w:pPr>
       <w:r>
         <w:rPr>
@@ -1784,7 +1997,8 @@
           <w:color w:val="08605A"/>
           <w:sz w:val="23"/>
         </w:rPr>
-        <w:t xml:space="preserve">◦  </w:t>
+        <w:t>◦</w:t>
+        <w:tab/>
       </w:r>
       <w:r>
         <w:rPr>
@@ -1841,8 +2055,12 @@
     </w:p>
     <w:p>
       <w:pPr>
+        <w:tabs>
+          <w:tab w:pos="510" w:val="left"/>
+        </w:tabs>
         <w:spacing w:before="0" w:after="100" w:line="300" w:lineRule="auto"/>
-        <w:ind w:left="482" w:hanging="159"/>
+        <w:ind w:left="510" w:hanging="238"/>
+        <w:jc w:val="both"/>
       </w:pPr>
       <w:r>
         <w:rPr>
@@ -1852,7 +2070,8 @@
           <w:color w:val="08605A"/>
           <w:sz w:val="23"/>
         </w:rPr>
-        <w:t xml:space="preserve">•  </w:t>
+        <w:t>•</w:t>
+        <w:tab/>
       </w:r>
       <w:r>
         <w:rPr>
@@ -1867,8 +2086,12 @@
     </w:p>
     <w:p>
       <w:pPr>
+        <w:tabs>
+          <w:tab w:pos="918" w:val="left"/>
+        </w:tabs>
         <w:spacing w:before="0" w:after="100" w:line="300" w:lineRule="auto"/>
-        <w:ind w:left="879" w:hanging="159"/>
+        <w:ind w:left="918" w:hanging="238"/>
+        <w:jc w:val="both"/>
       </w:pPr>
       <w:r>
         <w:rPr>
@@ -1878,7 +2101,8 @@
           <w:color w:val="08605A"/>
           <w:sz w:val="23"/>
         </w:rPr>
-        <w:t xml:space="preserve">◦  </w:t>
+        <w:t>◦</w:t>
+        <w:tab/>
       </w:r>
       <w:r>
         <w:rPr>
@@ -1893,8 +2117,12 @@
     </w:p>
     <w:p>
       <w:pPr>
+        <w:tabs>
+          <w:tab w:pos="918" w:val="left"/>
+        </w:tabs>
         <w:spacing w:before="0" w:after="100" w:line="300" w:lineRule="auto"/>
-        <w:ind w:left="879" w:hanging="159"/>
+        <w:ind w:left="918" w:hanging="238"/>
+        <w:jc w:val="both"/>
       </w:pPr>
       <w:r>
         <w:rPr>
@@ -1904,7 +2132,8 @@
           <w:color w:val="08605A"/>
           <w:sz w:val="23"/>
         </w:rPr>
-        <w:t xml:space="preserve">◦  </w:t>
+        <w:t>◦</w:t>
+        <w:tab/>
       </w:r>
       <w:r>
         <w:rPr>
@@ -1919,8 +2148,12 @@
     </w:p>
     <w:p>
       <w:pPr>
+        <w:tabs>
+          <w:tab w:pos="510" w:val="left"/>
+        </w:tabs>
         <w:spacing w:before="0" w:after="100" w:line="300" w:lineRule="auto"/>
-        <w:ind w:left="482" w:hanging="159"/>
+        <w:ind w:left="510" w:hanging="238"/>
+        <w:jc w:val="both"/>
       </w:pPr>
       <w:r>
         <w:rPr>
@@ -1930,7 +2163,8 @@
           <w:color w:val="08605A"/>
           <w:sz w:val="23"/>
         </w:rPr>
-        <w:t xml:space="preserve">•  </w:t>
+        <w:t>•</w:t>
+        <w:tab/>
       </w:r>
       <w:r>
         <w:rPr>
@@ -1945,8 +2179,12 @@
     </w:p>
     <w:p>
       <w:pPr>
+        <w:tabs>
+          <w:tab w:pos="918" w:val="left"/>
+        </w:tabs>
         <w:spacing w:before="0" w:after="100" w:line="300" w:lineRule="auto"/>
-        <w:ind w:left="879" w:hanging="159"/>
+        <w:ind w:left="918" w:hanging="238"/>
+        <w:jc w:val="both"/>
       </w:pPr>
       <w:r>
         <w:rPr>
@@ -1956,7 +2194,8 @@
           <w:color w:val="08605A"/>
           <w:sz w:val="23"/>
         </w:rPr>
-        <w:t xml:space="preserve">◦  </w:t>
+        <w:t>◦</w:t>
+        <w:tab/>
       </w:r>
       <w:r>
         <w:rPr>
@@ -1971,8 +2210,12 @@
     </w:p>
     <w:p>
       <w:pPr>
+        <w:tabs>
+          <w:tab w:pos="918" w:val="left"/>
+        </w:tabs>
         <w:spacing w:before="0" w:after="100" w:line="300" w:lineRule="auto"/>
-        <w:ind w:left="879" w:hanging="159"/>
+        <w:ind w:left="918" w:hanging="238"/>
+        <w:jc w:val="both"/>
       </w:pPr>
       <w:r>
         <w:rPr>
@@ -1982,7 +2225,8 @@
           <w:color w:val="08605A"/>
           <w:sz w:val="23"/>
         </w:rPr>
-        <w:t xml:space="preserve">◦  </w:t>
+        <w:t>◦</w:t>
+        <w:tab/>
       </w:r>
       <w:r>
         <w:rPr>
@@ -2066,8 +2310,12 @@
     </w:p>
     <w:p>
       <w:pPr>
+        <w:tabs>
+          <w:tab w:pos="510" w:val="left"/>
+        </w:tabs>
         <w:spacing w:before="0" w:after="100" w:line="300" w:lineRule="auto"/>
-        <w:ind w:left="482" w:hanging="159"/>
+        <w:ind w:left="510" w:hanging="238"/>
+        <w:jc w:val="both"/>
       </w:pPr>
       <w:r>
         <w:rPr>
@@ -2077,7 +2325,8 @@
           <w:color w:val="08605A"/>
           <w:sz w:val="23"/>
         </w:rPr>
-        <w:t xml:space="preserve">•  </w:t>
+        <w:t>•</w:t>
+        <w:tab/>
       </w:r>
       <w:r>
         <w:rPr>
@@ -2092,8 +2341,12 @@
     </w:p>
     <w:p>
       <w:pPr>
+        <w:tabs>
+          <w:tab w:pos="918" w:val="left"/>
+        </w:tabs>
         <w:spacing w:before="0" w:after="100" w:line="300" w:lineRule="auto"/>
-        <w:ind w:left="879" w:hanging="159"/>
+        <w:ind w:left="918" w:hanging="238"/>
+        <w:jc w:val="both"/>
       </w:pPr>
       <w:r>
         <w:rPr>
@@ -2103,7 +2356,8 @@
           <w:color w:val="08605A"/>
           <w:sz w:val="23"/>
         </w:rPr>
-        <w:t xml:space="preserve">◦  </w:t>
+        <w:t>◦</w:t>
+        <w:tab/>
       </w:r>
       <w:r>
         <w:rPr>
@@ -2118,8 +2372,12 @@
     </w:p>
     <w:p>
       <w:pPr>
+        <w:tabs>
+          <w:tab w:pos="918" w:val="left"/>
+        </w:tabs>
         <w:spacing w:before="0" w:after="100" w:line="300" w:lineRule="auto"/>
-        <w:ind w:left="879" w:hanging="159"/>
+        <w:ind w:left="918" w:hanging="238"/>
+        <w:jc w:val="both"/>
       </w:pPr>
       <w:r>
         <w:rPr>
@@ -2129,7 +2387,8 @@
           <w:color w:val="08605A"/>
           <w:sz w:val="23"/>
         </w:rPr>
-        <w:t xml:space="preserve">◦  </w:t>
+        <w:t>◦</w:t>
+        <w:tab/>
       </w:r>
       <w:r>
         <w:rPr>
@@ -2144,8 +2403,12 @@
     </w:p>
     <w:p>
       <w:pPr>
+        <w:tabs>
+          <w:tab w:pos="510" w:val="left"/>
+        </w:tabs>
         <w:spacing w:before="0" w:after="100" w:line="300" w:lineRule="auto"/>
-        <w:ind w:left="482" w:hanging="159"/>
+        <w:ind w:left="510" w:hanging="238"/>
+        <w:jc w:val="both"/>
       </w:pPr>
       <w:r>
         <w:rPr>
@@ -2155,7 +2418,8 @@
           <w:color w:val="08605A"/>
           <w:sz w:val="23"/>
         </w:rPr>
-        <w:t xml:space="preserve">•  </w:t>
+        <w:t>•</w:t>
+        <w:tab/>
       </w:r>
       <w:r>
         <w:rPr>
@@ -2170,8 +2434,12 @@
     </w:p>
     <w:p>
       <w:pPr>
+        <w:tabs>
+          <w:tab w:pos="918" w:val="left"/>
+        </w:tabs>
         <w:spacing w:before="0" w:after="100" w:line="300" w:lineRule="auto"/>
-        <w:ind w:left="879" w:hanging="159"/>
+        <w:ind w:left="918" w:hanging="238"/>
+        <w:jc w:val="both"/>
       </w:pPr>
       <w:r>
         <w:rPr>
@@ -2181,7 +2449,8 @@
           <w:color w:val="08605A"/>
           <w:sz w:val="23"/>
         </w:rPr>
-        <w:t xml:space="preserve">◦  </w:t>
+        <w:t>◦</w:t>
+        <w:tab/>
       </w:r>
       <w:r>
         <w:rPr>
@@ -2196,8 +2465,12 @@
     </w:p>
     <w:p>
       <w:pPr>
+        <w:tabs>
+          <w:tab w:pos="510" w:val="left"/>
+        </w:tabs>
         <w:spacing w:before="0" w:after="100" w:line="300" w:lineRule="auto"/>
-        <w:ind w:left="482" w:hanging="159"/>
+        <w:ind w:left="510" w:hanging="238"/>
+        <w:jc w:val="both"/>
       </w:pPr>
       <w:r>
         <w:rPr>
@@ -2207,7 +2480,8 @@
           <w:color w:val="08605A"/>
           <w:sz w:val="23"/>
         </w:rPr>
-        <w:t xml:space="preserve">•  </w:t>
+        <w:t>•</w:t>
+        <w:tab/>
       </w:r>
       <w:r>
         <w:rPr>
@@ -2222,8 +2496,12 @@
     </w:p>
     <w:p>
       <w:pPr>
+        <w:tabs>
+          <w:tab w:pos="918" w:val="left"/>
+        </w:tabs>
         <w:spacing w:before="0" w:after="100" w:line="300" w:lineRule="auto"/>
-        <w:ind w:left="879" w:hanging="159"/>
+        <w:ind w:left="918" w:hanging="238"/>
+        <w:jc w:val="both"/>
       </w:pPr>
       <w:r>
         <w:rPr>
@@ -2233,7 +2511,8 @@
           <w:color w:val="08605A"/>
           <w:sz w:val="23"/>
         </w:rPr>
-        <w:t xml:space="preserve">◦  </w:t>
+        <w:t>◦</w:t>
+        <w:tab/>
       </w:r>
       <w:r>
         <w:rPr>
@@ -2269,8 +2548,12 @@
     </w:p>
     <w:p>
       <w:pPr>
+        <w:tabs>
+          <w:tab w:pos="918" w:val="left"/>
+        </w:tabs>
         <w:spacing w:before="0" w:after="100" w:line="300" w:lineRule="auto"/>
-        <w:ind w:left="879" w:hanging="159"/>
+        <w:ind w:left="918" w:hanging="238"/>
+        <w:jc w:val="both"/>
       </w:pPr>
       <w:r>
         <w:rPr>
@@ -2280,7 +2563,8 @@
           <w:color w:val="08605A"/>
           <w:sz w:val="23"/>
         </w:rPr>
-        <w:t xml:space="preserve">◦  </w:t>
+        <w:t>◦</w:t>
+        <w:tab/>
       </w:r>
       <w:r>
         <w:rPr>
@@ -2295,8 +2579,12 @@
     </w:p>
     <w:p>
       <w:pPr>
+        <w:tabs>
+          <w:tab w:pos="918" w:val="left"/>
+        </w:tabs>
         <w:spacing w:before="0" w:after="100" w:line="300" w:lineRule="auto"/>
-        <w:ind w:left="879" w:hanging="159"/>
+        <w:ind w:left="918" w:hanging="238"/>
+        <w:jc w:val="both"/>
       </w:pPr>
       <w:r>
         <w:rPr>
@@ -2306,7 +2594,8 @@
           <w:color w:val="08605A"/>
           <w:sz w:val="23"/>
         </w:rPr>
-        <w:t xml:space="preserve">◦  </w:t>
+        <w:t>◦</w:t>
+        <w:tab/>
       </w:r>
       <w:r>
         <w:rPr>
@@ -2321,8 +2610,12 @@
     </w:p>
     <w:p>
       <w:pPr>
+        <w:tabs>
+          <w:tab w:pos="918" w:val="left"/>
+        </w:tabs>
         <w:spacing w:before="0" w:after="100" w:line="300" w:lineRule="auto"/>
-        <w:ind w:left="879" w:hanging="159"/>
+        <w:ind w:left="918" w:hanging="238"/>
+        <w:jc w:val="both"/>
       </w:pPr>
       <w:r>
         <w:rPr>
@@ -2332,7 +2625,8 @@
           <w:color w:val="08605A"/>
           <w:sz w:val="23"/>
         </w:rPr>
-        <w:t xml:space="preserve">◦  </w:t>
+        <w:t>◦</w:t>
+        <w:tab/>
       </w:r>
       <w:r>
         <w:rPr>
@@ -2347,8 +2641,12 @@
     </w:p>
     <w:p>
       <w:pPr>
+        <w:tabs>
+          <w:tab w:pos="918" w:val="left"/>
+        </w:tabs>
         <w:spacing w:before="0" w:after="100" w:line="300" w:lineRule="auto"/>
-        <w:ind w:left="879" w:hanging="159"/>
+        <w:ind w:left="918" w:hanging="238"/>
+        <w:jc w:val="both"/>
       </w:pPr>
       <w:r>
         <w:rPr>
@@ -2358,7 +2656,8 @@
           <w:color w:val="08605A"/>
           <w:sz w:val="23"/>
         </w:rPr>
-        <w:t xml:space="preserve">◦  </w:t>
+        <w:t>◦</w:t>
+        <w:tab/>
       </w:r>
       <w:r>
         <w:rPr>
@@ -2373,8 +2672,12 @@
     </w:p>
     <w:p>
       <w:pPr>
+        <w:tabs>
+          <w:tab w:pos="510" w:val="left"/>
+        </w:tabs>
         <w:spacing w:before="0" w:after="100" w:line="300" w:lineRule="auto"/>
-        <w:ind w:left="482" w:hanging="159"/>
+        <w:ind w:left="510" w:hanging="238"/>
+        <w:jc w:val="both"/>
       </w:pPr>
       <w:r>
         <w:rPr>
@@ -2384,7 +2687,8 @@
           <w:color w:val="08605A"/>
           <w:sz w:val="23"/>
         </w:rPr>
-        <w:t xml:space="preserve">•  </w:t>
+        <w:t>•</w:t>
+        <w:tab/>
       </w:r>
       <w:r>
         <w:rPr>
@@ -2399,8 +2703,12 @@
     </w:p>
     <w:p>
       <w:pPr>
+        <w:tabs>
+          <w:tab w:pos="918" w:val="left"/>
+        </w:tabs>
         <w:spacing w:before="0" w:after="100" w:line="300" w:lineRule="auto"/>
-        <w:ind w:left="879" w:hanging="159"/>
+        <w:ind w:left="918" w:hanging="238"/>
+        <w:jc w:val="both"/>
       </w:pPr>
       <w:r>
         <w:rPr>
@@ -2410,7 +2718,8 @@
           <w:color w:val="08605A"/>
           <w:sz w:val="23"/>
         </w:rPr>
-        <w:t xml:space="preserve">◦  </w:t>
+        <w:t>◦</w:t>
+        <w:tab/>
       </w:r>
       <w:r>
         <w:rPr>
@@ -2425,8 +2734,12 @@
     </w:p>
     <w:p>
       <w:pPr>
+        <w:tabs>
+          <w:tab w:pos="918" w:val="left"/>
+        </w:tabs>
         <w:spacing w:before="0" w:after="100" w:line="300" w:lineRule="auto"/>
-        <w:ind w:left="879" w:hanging="159"/>
+        <w:ind w:left="918" w:hanging="238"/>
+        <w:jc w:val="both"/>
       </w:pPr>
       <w:r>
         <w:rPr>
@@ -2436,7 +2749,8 @@
           <w:color w:val="08605A"/>
           <w:sz w:val="23"/>
         </w:rPr>
-        <w:t xml:space="preserve">◦  </w:t>
+        <w:t>◦</w:t>
+        <w:tab/>
       </w:r>
       <w:r>
         <w:rPr>
@@ -2520,8 +2834,12 @@
     </w:p>
     <w:p>
       <w:pPr>
+        <w:tabs>
+          <w:tab w:pos="918" w:val="left"/>
+        </w:tabs>
         <w:spacing w:before="0" w:after="100" w:line="300" w:lineRule="auto"/>
-        <w:ind w:left="879" w:hanging="159"/>
+        <w:ind w:left="918" w:hanging="238"/>
+        <w:jc w:val="both"/>
       </w:pPr>
       <w:r>
         <w:rPr>
@@ -2531,7 +2849,8 @@
           <w:color w:val="08605A"/>
           <w:sz w:val="23"/>
         </w:rPr>
-        <w:t xml:space="preserve">◦  </w:t>
+        <w:t>◦</w:t>
+        <w:tab/>
       </w:r>
       <w:r>
         <w:rPr>
@@ -2642,8 +2961,12 @@
     </w:p>
     <w:p>
       <w:pPr>
+        <w:tabs>
+          <w:tab w:pos="918" w:val="left"/>
+        </w:tabs>
         <w:spacing w:before="0" w:after="100" w:line="300" w:lineRule="auto"/>
-        <w:ind w:left="879" w:hanging="159"/>
+        <w:ind w:left="918" w:hanging="238"/>
+        <w:jc w:val="both"/>
       </w:pPr>
       <w:r>
         <w:rPr>
@@ -2653,7 +2976,8 @@
           <w:color w:val="08605A"/>
           <w:sz w:val="23"/>
         </w:rPr>
-        <w:t xml:space="preserve">◦  </w:t>
+        <w:t>◦</w:t>
+        <w:tab/>
       </w:r>
       <w:r>
         <w:rPr>
@@ -2668,8 +2992,12 @@
     </w:p>
     <w:p>
       <w:pPr>
+        <w:tabs>
+          <w:tab w:pos="918" w:val="left"/>
+        </w:tabs>
         <w:spacing w:before="0" w:after="100" w:line="300" w:lineRule="auto"/>
-        <w:ind w:left="879" w:hanging="159"/>
+        <w:ind w:left="918" w:hanging="238"/>
+        <w:jc w:val="both"/>
       </w:pPr>
       <w:r>
         <w:rPr>
@@ -2679,7 +3007,8 @@
           <w:color w:val="08605A"/>
           <w:sz w:val="23"/>
         </w:rPr>
-        <w:t xml:space="preserve">◦  </w:t>
+        <w:t>◦</w:t>
+        <w:tab/>
       </w:r>
       <w:r>
         <w:rPr>
@@ -2694,8 +3023,12 @@
     </w:p>
     <w:p>
       <w:pPr>
+        <w:tabs>
+          <w:tab w:pos="510" w:val="left"/>
+        </w:tabs>
         <w:spacing w:before="0" w:after="100" w:line="300" w:lineRule="auto"/>
-        <w:ind w:left="482" w:hanging="159"/>
+        <w:ind w:left="510" w:hanging="238"/>
+        <w:jc w:val="both"/>
       </w:pPr>
       <w:r>
         <w:rPr>
@@ -2705,7 +3038,8 @@
           <w:color w:val="08605A"/>
           <w:sz w:val="23"/>
         </w:rPr>
-        <w:t xml:space="preserve">•  </w:t>
+        <w:t>•</w:t>
+        <w:tab/>
       </w:r>
       <w:r>
         <w:rPr>
@@ -2720,8 +3054,12 @@
     </w:p>
     <w:p>
       <w:pPr>
+        <w:tabs>
+          <w:tab w:pos="918" w:val="left"/>
+        </w:tabs>
         <w:spacing w:before="0" w:after="100" w:line="300" w:lineRule="auto"/>
-        <w:ind w:left="879" w:hanging="159"/>
+        <w:ind w:left="918" w:hanging="238"/>
+        <w:jc w:val="both"/>
       </w:pPr>
       <w:r>
         <w:rPr>
@@ -2731,7 +3069,8 @@
           <w:color w:val="08605A"/>
           <w:sz w:val="23"/>
         </w:rPr>
-        <w:t xml:space="preserve">◦  </w:t>
+        <w:t>◦</w:t>
+        <w:tab/>
       </w:r>
       <w:r>
         <w:rPr>
@@ -2746,8 +3085,12 @@
     </w:p>
     <w:p>
       <w:pPr>
+        <w:tabs>
+          <w:tab w:pos="918" w:val="left"/>
+        </w:tabs>
         <w:spacing w:before="0" w:after="100" w:line="300" w:lineRule="auto"/>
-        <w:ind w:left="879" w:hanging="159"/>
+        <w:ind w:left="918" w:hanging="238"/>
+        <w:jc w:val="both"/>
       </w:pPr>
       <w:r>
         <w:rPr>
@@ -2757,7 +3100,8 @@
           <w:color w:val="08605A"/>
           <w:sz w:val="23"/>
         </w:rPr>
-        <w:t xml:space="preserve">◦  </w:t>
+        <w:t>◦</w:t>
+        <w:tab/>
       </w:r>
       <w:r>
         <w:rPr>
@@ -2772,8 +3116,12 @@
     </w:p>
     <w:p>
       <w:pPr>
+        <w:tabs>
+          <w:tab w:pos="510" w:val="left"/>
+        </w:tabs>
         <w:spacing w:before="0" w:after="100" w:line="300" w:lineRule="auto"/>
-        <w:ind w:left="482" w:hanging="159"/>
+        <w:ind w:left="510" w:hanging="238"/>
+        <w:jc w:val="both"/>
       </w:pPr>
       <w:r>
         <w:rPr>
@@ -2783,7 +3131,8 @@
           <w:color w:val="08605A"/>
           <w:sz w:val="23"/>
         </w:rPr>
-        <w:t xml:space="preserve">•  </w:t>
+        <w:t>•</w:t>
+        <w:tab/>
       </w:r>
       <w:r>
         <w:rPr>
@@ -2798,8 +3147,12 @@
     </w:p>
     <w:p>
       <w:pPr>
+        <w:tabs>
+          <w:tab w:pos="918" w:val="left"/>
+        </w:tabs>
         <w:spacing w:before="0" w:after="100" w:line="300" w:lineRule="auto"/>
-        <w:ind w:left="879" w:hanging="159"/>
+        <w:ind w:left="918" w:hanging="238"/>
+        <w:jc w:val="both"/>
       </w:pPr>
       <w:r>
         <w:rPr>
@@ -2809,7 +3162,8 @@
           <w:color w:val="08605A"/>
           <w:sz w:val="23"/>
         </w:rPr>
-        <w:t xml:space="preserve">◦  </w:t>
+        <w:t>◦</w:t>
+        <w:tab/>
       </w:r>
       <w:r>
         <w:rPr>
@@ -2824,8 +3178,12 @@
     </w:p>
     <w:p>
       <w:pPr>
+        <w:tabs>
+          <w:tab w:pos="918" w:val="left"/>
+        </w:tabs>
         <w:spacing w:before="0" w:after="100" w:line="300" w:lineRule="auto"/>
-        <w:ind w:left="879" w:hanging="159"/>
+        <w:ind w:left="918" w:hanging="238"/>
+        <w:jc w:val="both"/>
       </w:pPr>
       <w:r>
         <w:rPr>
@@ -2835,7 +3193,8 @@
           <w:color w:val="08605A"/>
           <w:sz w:val="23"/>
         </w:rPr>
-        <w:t xml:space="preserve">◦  </w:t>
+        <w:t>◦</w:t>
+        <w:tab/>
       </w:r>
       <w:r>
         <w:rPr>
@@ -2852,6 +3211,7 @@
       <w:pPr>
         <w:pStyle w:val="Heading1"/>
         <w:spacing w:before="360" w:after="160" w:line="259" w:lineRule="auto"/>
+        <w:jc w:val="left"/>
         <w:pBdr>
           <w:bottom w:val="single" w:sz="8" w:space="4" w:color="A9E5DD"/>
         </w:pBdr>
@@ -2869,8 +3229,12 @@
     </w:p>
     <w:p>
       <w:pPr>
+        <w:tabs>
+          <w:tab w:pos="510" w:val="left"/>
+        </w:tabs>
         <w:spacing w:before="0" w:after="100" w:line="300" w:lineRule="auto"/>
-        <w:ind w:left="482" w:hanging="159"/>
+        <w:ind w:left="510" w:hanging="238"/>
+        <w:jc w:val="both"/>
       </w:pPr>
       <w:r>
         <w:rPr>
@@ -2880,7 +3244,8 @@
           <w:color w:val="08605A"/>
           <w:sz w:val="23"/>
         </w:rPr>
-        <w:t xml:space="preserve">•  </w:t>
+        <w:t>•</w:t>
+        <w:tab/>
       </w:r>
       <w:r>
         <w:rPr>
@@ -2916,8 +3281,12 @@
     </w:p>
     <w:p>
       <w:pPr>
+        <w:tabs>
+          <w:tab w:pos="510" w:val="left"/>
+        </w:tabs>
         <w:spacing w:before="0" w:after="100" w:line="300" w:lineRule="auto"/>
-        <w:ind w:left="482" w:hanging="159"/>
+        <w:ind w:left="510" w:hanging="238"/>
+        <w:jc w:val="both"/>
       </w:pPr>
       <w:r>
         <w:rPr>
@@ -2927,7 +3296,8 @@
           <w:color w:val="08605A"/>
           <w:sz w:val="23"/>
         </w:rPr>
-        <w:t xml:space="preserve">•  </w:t>
+        <w:t>•</w:t>
+        <w:tab/>
       </w:r>
       <w:r>
         <w:rPr>
@@ -2942,8 +3312,12 @@
     </w:p>
     <w:p>
       <w:pPr>
+        <w:tabs>
+          <w:tab w:pos="918" w:val="left"/>
+        </w:tabs>
         <w:spacing w:before="0" w:after="100" w:line="300" w:lineRule="auto"/>
-        <w:ind w:left="879" w:hanging="159"/>
+        <w:ind w:left="918" w:hanging="238"/>
+        <w:jc w:val="both"/>
       </w:pPr>
       <w:r>
         <w:rPr>
@@ -2953,7 +3327,8 @@
           <w:color w:val="08605A"/>
           <w:sz w:val="23"/>
         </w:rPr>
-        <w:t xml:space="preserve">◦  </w:t>
+        <w:t>◦</w:t>
+        <w:tab/>
       </w:r>
       <w:r>
         <w:rPr>
@@ -2969,8 +3344,12 @@
     </w:p>
     <w:p>
       <w:pPr>
+        <w:tabs>
+          <w:tab w:pos="918" w:val="left"/>
+        </w:tabs>
         <w:spacing w:before="0" w:after="100" w:line="300" w:lineRule="auto"/>
-        <w:ind w:left="879" w:hanging="159"/>
+        <w:ind w:left="918" w:hanging="238"/>
+        <w:jc w:val="both"/>
       </w:pPr>
       <w:r>
         <w:rPr>
@@ -2980,7 +3359,8 @@
           <w:color w:val="08605A"/>
           <w:sz w:val="23"/>
         </w:rPr>
-        <w:t xml:space="preserve">◦  </w:t>
+        <w:t>◦</w:t>
+        <w:tab/>
       </w:r>
       <w:r>
         <w:rPr>
@@ -2996,8 +3376,12 @@
     </w:p>
     <w:p>
       <w:pPr>
+        <w:tabs>
+          <w:tab w:pos="510" w:val="left"/>
+        </w:tabs>
         <w:spacing w:before="0" w:after="100" w:line="300" w:lineRule="auto"/>
-        <w:ind w:left="482" w:hanging="159"/>
+        <w:ind w:left="510" w:hanging="238"/>
+        <w:jc w:val="both"/>
       </w:pPr>
       <w:r>
         <w:rPr>
@@ -3007,7 +3391,8 @@
           <w:color w:val="08605A"/>
           <w:sz w:val="23"/>
         </w:rPr>
-        <w:t xml:space="preserve">•  </w:t>
+        <w:t>•</w:t>
+        <w:tab/>
       </w:r>
       <w:r>
         <w:rPr>
@@ -3022,8 +3407,12 @@
     </w:p>
     <w:p>
       <w:pPr>
+        <w:tabs>
+          <w:tab w:pos="510" w:val="left"/>
+        </w:tabs>
         <w:spacing w:before="0" w:after="100" w:line="300" w:lineRule="auto"/>
-        <w:ind w:left="482" w:hanging="159"/>
+        <w:ind w:left="510" w:hanging="238"/>
+        <w:jc w:val="both"/>
       </w:pPr>
       <w:r>
         <w:rPr>
@@ -3033,7 +3422,8 @@
           <w:color w:val="08605A"/>
           <w:sz w:val="23"/>
         </w:rPr>
-        <w:t xml:space="preserve">•  </w:t>
+        <w:t>•</w:t>
+        <w:tab/>
       </w:r>
       <w:r>
         <w:rPr>
@@ -3050,6 +3440,7 @@
       <w:pPr>
         <w:pStyle w:val="Heading1"/>
         <w:spacing w:before="360" w:after="160" w:line="259" w:lineRule="auto"/>
+        <w:jc w:val="left"/>
         <w:pBdr>
           <w:bottom w:val="single" w:sz="8" w:space="4" w:color="A9E5DD"/>
         </w:pBdr>
@@ -3067,8 +3458,12 @@
     </w:p>
     <w:p>
       <w:pPr>
+        <w:tabs>
+          <w:tab w:pos="510" w:val="left"/>
+        </w:tabs>
         <w:spacing w:before="0" w:after="100" w:line="300" w:lineRule="auto"/>
-        <w:ind w:left="482" w:hanging="159"/>
+        <w:ind w:left="510" w:hanging="238"/>
+        <w:jc w:val="both"/>
       </w:pPr>
       <w:r>
         <w:rPr>
@@ -3078,7 +3473,8 @@
           <w:color w:val="08605A"/>
           <w:sz w:val="23"/>
         </w:rPr>
-        <w:t xml:space="preserve">•  </w:t>
+        <w:t>•</w:t>
+        <w:tab/>
       </w:r>
       <w:r>
         <w:rPr>
@@ -3093,8 +3489,12 @@
     </w:p>
     <w:p>
       <w:pPr>
+        <w:tabs>
+          <w:tab w:pos="510" w:val="left"/>
+        </w:tabs>
         <w:spacing w:before="0" w:after="100" w:line="300" w:lineRule="auto"/>
-        <w:ind w:left="482" w:hanging="159"/>
+        <w:ind w:left="510" w:hanging="238"/>
+        <w:jc w:val="both"/>
       </w:pPr>
       <w:r>
         <w:rPr>
@@ -3104,7 +3504,8 @@
           <w:color w:val="08605A"/>
           <w:sz w:val="23"/>
         </w:rPr>
-        <w:t xml:space="preserve">•  </w:t>
+        <w:t>•</w:t>
+        <w:tab/>
       </w:r>
       <w:r>
         <w:rPr>
@@ -3161,8 +3562,12 @@
     </w:p>
     <w:p>
       <w:pPr>
+        <w:tabs>
+          <w:tab w:pos="510" w:val="left"/>
+        </w:tabs>
         <w:spacing w:before="0" w:after="100" w:line="300" w:lineRule="auto"/>
-        <w:ind w:left="482" w:hanging="159"/>
+        <w:ind w:left="510" w:hanging="238"/>
+        <w:jc w:val="both"/>
       </w:pPr>
       <w:r>
         <w:rPr>
@@ -3172,7 +3577,8 @@
           <w:color w:val="08605A"/>
           <w:sz w:val="23"/>
         </w:rPr>
-        <w:t xml:space="preserve">•  </w:t>
+        <w:t>•</w:t>
+        <w:tab/>
       </w:r>
       <w:r>
         <w:rPr>
@@ -3189,6 +3595,7 @@
       <w:pPr>
         <w:pStyle w:val="Heading1"/>
         <w:spacing w:before="360" w:after="160" w:line="259" w:lineRule="auto"/>
+        <w:jc w:val="left"/>
         <w:pBdr>
           <w:bottom w:val="single" w:sz="8" w:space="4" w:color="A9E5DD"/>
         </w:pBdr>
@@ -3206,8 +3613,12 @@
     </w:p>
     <w:p>
       <w:pPr>
+        <w:tabs>
+          <w:tab w:pos="510" w:val="left"/>
+        </w:tabs>
         <w:spacing w:before="0" w:after="100" w:line="300" w:lineRule="auto"/>
-        <w:ind w:left="482" w:hanging="159"/>
+        <w:ind w:left="510" w:hanging="238"/>
+        <w:jc w:val="both"/>
       </w:pPr>
       <w:r>
         <w:rPr>
@@ -3217,7 +3628,8 @@
           <w:color w:val="08605A"/>
           <w:sz w:val="23"/>
         </w:rPr>
-        <w:t xml:space="preserve">•  </w:t>
+        <w:t>•</w:t>
+        <w:tab/>
       </w:r>
       <w:r>
         <w:rPr>
@@ -3232,8 +3644,12 @@
     </w:p>
     <w:p>
       <w:pPr>
+        <w:tabs>
+          <w:tab w:pos="510" w:val="left"/>
+        </w:tabs>
         <w:spacing w:before="0" w:after="100" w:line="300" w:lineRule="auto"/>
-        <w:ind w:left="482" w:hanging="159"/>
+        <w:ind w:left="510" w:hanging="238"/>
+        <w:jc w:val="both"/>
       </w:pPr>
       <w:r>
         <w:rPr>
@@ -3243,7 +3659,8 @@
           <w:color w:val="08605A"/>
           <w:sz w:val="23"/>
         </w:rPr>
-        <w:t xml:space="preserve">•  </w:t>
+        <w:t>•</w:t>
+        <w:tab/>
       </w:r>
       <w:r>
         <w:rPr>
@@ -3258,8 +3675,12 @@
     </w:p>
     <w:p>
       <w:pPr>
+        <w:tabs>
+          <w:tab w:pos="510" w:val="left"/>
+        </w:tabs>
         <w:spacing w:before="0" w:after="100" w:line="300" w:lineRule="auto"/>
-        <w:ind w:left="482" w:hanging="159"/>
+        <w:ind w:left="510" w:hanging="238"/>
+        <w:jc w:val="both"/>
       </w:pPr>
       <w:r>
         <w:rPr>
@@ -3269,7 +3690,8 @@
           <w:color w:val="08605A"/>
           <w:sz w:val="23"/>
         </w:rPr>
-        <w:t xml:space="preserve">•  </w:t>
+        <w:t>•</w:t>
+        <w:tab/>
       </w:r>
       <w:r>
         <w:rPr>
@@ -3284,8 +3706,12 @@
     </w:p>
     <w:p>
       <w:pPr>
+        <w:tabs>
+          <w:tab w:pos="510" w:val="left"/>
+        </w:tabs>
         <w:spacing w:before="0" w:after="100" w:line="300" w:lineRule="auto"/>
-        <w:ind w:left="482" w:hanging="159"/>
+        <w:ind w:left="510" w:hanging="238"/>
+        <w:jc w:val="both"/>
       </w:pPr>
       <w:r>
         <w:rPr>
@@ -3295,7 +3721,8 @@
           <w:color w:val="08605A"/>
           <w:sz w:val="23"/>
         </w:rPr>
-        <w:t xml:space="preserve">•  </w:t>
+        <w:t>•</w:t>
+        <w:tab/>
       </w:r>
       <w:r>
         <w:rPr>
@@ -3312,6 +3739,7 @@
       <w:pPr>
         <w:pStyle w:val="Heading1"/>
         <w:spacing w:before="360" w:after="160" w:line="259" w:lineRule="auto"/>
+        <w:jc w:val="left"/>
         <w:pBdr>
           <w:bottom w:val="single" w:sz="8" w:space="4" w:color="A9E5DD"/>
         </w:pBdr>
@@ -3329,8 +3757,12 @@
     </w:p>
     <w:p>
       <w:pPr>
+        <w:tabs>
+          <w:tab w:pos="510" w:val="left"/>
+        </w:tabs>
         <w:spacing w:before="0" w:after="100" w:line="300" w:lineRule="auto"/>
-        <w:ind w:left="482" w:hanging="159"/>
+        <w:ind w:left="510" w:hanging="238"/>
+        <w:jc w:val="both"/>
       </w:pPr>
       <w:r>
         <w:rPr>
@@ -3340,7 +3772,8 @@
           <w:color w:val="08605A"/>
           <w:sz w:val="23"/>
         </w:rPr>
-        <w:t xml:space="preserve">•  </w:t>
+        <w:t>•</w:t>
+        <w:tab/>
       </w:r>
       <w:r>
         <w:rPr>
@@ -3355,8 +3788,12 @@
     </w:p>
     <w:p>
       <w:pPr>
+        <w:tabs>
+          <w:tab w:pos="510" w:val="left"/>
+        </w:tabs>
         <w:spacing w:before="0" w:after="100" w:line="300" w:lineRule="auto"/>
-        <w:ind w:left="482" w:hanging="159"/>
+        <w:ind w:left="510" w:hanging="238"/>
+        <w:jc w:val="both"/>
       </w:pPr>
       <w:r>
         <w:rPr>
@@ -3366,7 +3803,8 @@
           <w:color w:val="08605A"/>
           <w:sz w:val="23"/>
         </w:rPr>
-        <w:t xml:space="preserve">•  </w:t>
+        <w:t>•</w:t>
+        <w:tab/>
       </w:r>
       <w:r>
         <w:rPr>
@@ -3381,8 +3819,12 @@
     </w:p>
     <w:p>
       <w:pPr>
+        <w:tabs>
+          <w:tab w:pos="510" w:val="left"/>
+        </w:tabs>
         <w:spacing w:before="0" w:after="100" w:line="300" w:lineRule="auto"/>
-        <w:ind w:left="482" w:hanging="159"/>
+        <w:ind w:left="510" w:hanging="238"/>
+        <w:jc w:val="both"/>
       </w:pPr>
       <w:r>
         <w:rPr>
@@ -3392,7 +3834,8 @@
           <w:color w:val="08605A"/>
           <w:sz w:val="23"/>
         </w:rPr>
-        <w:t xml:space="preserve">•  </w:t>
+        <w:t>•</w:t>
+        <w:tab/>
       </w:r>
       <w:r>
         <w:rPr>
@@ -3407,8 +3850,12 @@
     </w:p>
     <w:p>
       <w:pPr>
+        <w:tabs>
+          <w:tab w:pos="510" w:val="left"/>
+        </w:tabs>
         <w:spacing w:before="0" w:after="100" w:line="300" w:lineRule="auto"/>
-        <w:ind w:left="482" w:hanging="159"/>
+        <w:ind w:left="510" w:hanging="238"/>
+        <w:jc w:val="both"/>
       </w:pPr>
       <w:r>
         <w:rPr>
@@ -3418,7 +3865,8 @@
           <w:color w:val="08605A"/>
           <w:sz w:val="23"/>
         </w:rPr>
-        <w:t xml:space="preserve">•  </w:t>
+        <w:t>•</w:t>
+        <w:tab/>
       </w:r>
       <w:r>
         <w:rPr>

</xml_diff>